<commit_message>
feat: add AlertDialog component and related hooks
- Implemented AlertDialog component using Radix UI with customizable triggers, overlays, and content.
- Added hooks for authentication management, including user role labels and initials extraction.
- Created SQL dump for initial database setup, including tables for users, devices, leave requests, and more.
- Added migration script to fix duplicate indexes on the users table, ensuring database integrity.
</commit_message>
<xml_diff>
--- a/thesis/doc/QTHD_QLHC.docx
+++ b/thesis/doc/QTHD_QLHC.docx
@@ -1,6 +1,6 @@
 
 <file path=word/document.xml><?xml version="1.0" encoding="utf-8"?>
-<w:document xmlns:wpc="http://schemas.microsoft.com/office/word/2010/wordprocessingCanvas" xmlns:cx="http://schemas.microsoft.com/office/drawing/2014/chartex" xmlns:cx1="http://schemas.microsoft.com/office/drawing/2015/9/8/chartex" xmlns:cx2="http://schemas.microsoft.com/office/drawing/2015/10/21/chartex" xmlns:cx3="http://schemas.microsoft.com/office/drawing/2016/5/9/chartex" xmlns:cx4="http://schemas.microsoft.com/office/drawing/2016/5/10/chartex" xmlns:cx5="http://schemas.microsoft.com/office/drawing/2016/5/11/chartex" xmlns:cx6="http://schemas.microsoft.com/office/drawing/2016/5/12/chartex" xmlns:cx7="http://schemas.microsoft.com/office/drawing/2016/5/13/chartex" xmlns:cx8="http://schemas.microsoft.com/office/drawing/2016/5/14/chartex" xmlns:mc="http://schemas.openxmlformats.org/markup-compatibility/2006" xmlns:aink="http://schemas.microsoft.com/office/drawing/2016/ink" xmlns:am3d="http://schemas.microsoft.com/office/drawing/2017/model3d" xmlns:o="urn:schemas-microsoft-com:office:office" xmlns:oel="http://schemas.microsoft.com/office/2019/extlst" xmlns:r="http://schemas.openxmlformats.org/officeDocument/2006/relationships" xmlns:m="http://schemas.openxmlformats.org/officeDocument/2006/math" xmlns:v="urn:schemas-microsoft-com:vml" xmlns:wp14="http://schemas.microsoft.com/office/word/2010/wordprocessingDrawing" xmlns:wp="http://schemas.openxmlformats.org/drawingml/2006/wordprocessingDrawing" xmlns:w10="urn:schemas-microsoft-com:office:word" xmlns:w="http://schemas.openxmlformats.org/wordprocessingml/2006/main" xmlns:w14="http://schemas.microsoft.com/office/word/2010/wordml" xmlns:w15="http://schemas.microsoft.com/office/word/2012/wordml" xmlns:w16cex="http://schemas.microsoft.com/office/word/2018/wordml/cex" xmlns:w16cid="http://schemas.microsoft.com/office/word/2016/wordml/cid" xmlns:w16="http://schemas.microsoft.com/office/word/2018/wordml" xmlns:w16du="http://schemas.microsoft.com/office/word/2023/wordml/word16du" xmlns:w16sdtdh="http://schemas.microsoft.com/office/word/2020/wordml/sdtdatahash" xmlns:w16se="http://schemas.microsoft.com/office/word/2015/wordml/symex" xmlns:wpg="http://schemas.microsoft.com/office/word/2010/wordprocessingGroup" xmlns:wpi="http://schemas.microsoft.com/office/word/2010/wordprocessingInk" xmlns:wne="http://schemas.microsoft.com/office/word/2006/wordml" xmlns:wps="http://schemas.microsoft.com/office/word/2010/wordprocessingShape" mc:Ignorable="w14 w15 w16se w16cid w16 w16cex w16sdtdh w16du wp14">
+<w:document xmlns:wpc="http://schemas.microsoft.com/office/word/2010/wordprocessingCanvas" xmlns:cx="http://schemas.microsoft.com/office/drawing/2014/chartex" xmlns:mc="http://schemas.openxmlformats.org/markup-compatibility/2006" xmlns:o="urn:schemas-microsoft-com:office:office" xmlns:r="http://schemas.openxmlformats.org/officeDocument/2006/relationships" xmlns:m="http://schemas.openxmlformats.org/officeDocument/2006/math" xmlns:v="urn:schemas-microsoft-com:vml" xmlns:wp14="http://schemas.microsoft.com/office/word/2010/wordprocessingDrawing" xmlns:wp="http://schemas.openxmlformats.org/drawingml/2006/wordprocessingDrawing" xmlns:w10="urn:schemas-microsoft-com:office:word" xmlns:w="http://schemas.openxmlformats.org/wordprocessingml/2006/main" xmlns:w14="http://schemas.microsoft.com/office/word/2010/wordml" xmlns:w15="http://schemas.microsoft.com/office/word/2012/wordml" xmlns:w16se="http://schemas.microsoft.com/office/word/2015/wordml/symex" xmlns:wpg="http://schemas.microsoft.com/office/word/2010/wordprocessingGroup" xmlns:wpi="http://schemas.microsoft.com/office/word/2010/wordprocessingInk" xmlns:wne="http://schemas.microsoft.com/office/word/2006/wordml" xmlns:wps="http://schemas.microsoft.com/office/word/2010/wordprocessingShape" mc:Ignorable="w14 w15 w16se wp14">
   <w:body>
     <w:p>
       <w:pPr>
@@ -471,12 +471,21 @@
           <w:ilvl w:val="1"/>
           <w:numId w:val="1"/>
         </w:numPr>
-      </w:pPr>
-      <w:r>
-        <w:t>Nhân viên</w:t>
-      </w:r>
-      <w:r>
-        <w:t xml:space="preserve"> </w:t>
+        <w:rPr>
+          <w:highlight w:val="yellow"/>
+        </w:rPr>
+      </w:pPr>
+      <w:r>
+        <w:rPr>
+          <w:highlight w:val="yellow"/>
+        </w:rPr>
+        <w:t xml:space="preserve">Nhân viên </w:t>
+      </w:r>
+      <w:r>
+        <w:rPr>
+          <w:highlight w:val="yellow"/>
+        </w:rPr>
+        <w:t>kỹ thuật</w:t>
       </w:r>
     </w:p>
     <w:p>
@@ -587,7 +596,15 @@
         <w:jc w:val="both"/>
       </w:pPr>
       <w:r>
-        <w:t>Chức năng Quản lý công lệnh dùng để tạo, phê duyệt và theo dõi các công việc được giao trong đơn vị (ví dụ: phân công sửa chữa, kiểm tra thiết bị, thực hiện nhiệm vụ hành chính,…).</w:t>
+        <w:t xml:space="preserve">Chức năng Quản lý công lệnh dùng để tạo, phê duyệt và theo dõi các công việc được giao trong đơn vị (ví dụ: phân công sửa chữa, kiểm tra thiết bị, thực hiện nhiệm vụ hành </w:t>
+      </w:r>
+      <w:proofErr w:type="gramStart"/>
+      <w:r>
+        <w:t>chính,…</w:t>
+      </w:r>
+      <w:proofErr w:type="gramEnd"/>
+      <w:r>
+        <w:t>).</w:t>
       </w:r>
     </w:p>
     <w:p>
@@ -614,7 +631,27 @@
         </w:numPr>
       </w:pPr>
       <w:r>
-        <w:t>Cán bộ quản lý hoặc người có thẩm quyền tạo công lệnh.</w:t>
+        <w:t>Cán bộ quản lý</w:t>
+      </w:r>
+      <w:r>
+        <w:t>, giáo viên, nhân viên</w:t>
+      </w:r>
+      <w:r>
+        <w:t xml:space="preserve"> kỹ </w:t>
+      </w:r>
+      <w:proofErr w:type="gramStart"/>
+      <w:r>
+        <w:t>thuật</w:t>
+      </w:r>
+      <w:r>
+        <w:t xml:space="preserve">, </w:t>
+      </w:r>
+      <w:r>
+        <w:t xml:space="preserve"> quyền</w:t>
+      </w:r>
+      <w:proofErr w:type="gramEnd"/>
+      <w:r>
+        <w:t xml:space="preserve"> tạo công lệnh.</w:t>
       </w:r>
     </w:p>
     <w:p>
@@ -720,7 +757,16 @@
         </w:numPr>
       </w:pPr>
       <w:r>
-        <w:t xml:space="preserve">Nhân viên được giao nhận thông báo </w:t>
+        <w:t>Nhân viên</w:t>
+      </w:r>
+      <w:r>
+        <w:t xml:space="preserve"> kỹ thuật</w:t>
+      </w:r>
+      <w:r>
+        <w:t>, giáo viên</w:t>
+      </w:r>
+      <w:r>
+        <w:t xml:space="preserve"> được giao nhận thông báo </w:t>
       </w:r>
       <w:r>
         <w:t>qua</w:t>
@@ -790,6 +836,9 @@
       <w:r>
         <w:t xml:space="preserve"> duyệt</w:t>
       </w:r>
+      <w:r>
+        <w:t xml:space="preserve"> (do cán bộ quản lý duyệt)</w:t>
+      </w:r>
     </w:p>
     <w:p>
       <w:pPr>
@@ -799,7 +848,13 @@
         </w:numPr>
       </w:pPr>
       <w:r>
-        <w:t>Nhân viên thực hiện công việc.</w:t>
+        <w:t>Nhân viên</w:t>
+      </w:r>
+      <w:r>
+        <w:t xml:space="preserve"> kỹ thuật</w:t>
+      </w:r>
+      <w:r>
+        <w:t xml:space="preserve"> thực hiện công việc.</w:t>
       </w:r>
     </w:p>
     <w:p>
@@ -818,7 +873,13 @@
         </w:numPr>
       </w:pPr>
       <w:r>
-        <w:t>Nhân viên nhấn “Hoàn thành”.</w:t>
+        <w:t>Nhân viên</w:t>
+      </w:r>
+      <w:r>
+        <w:t xml:space="preserve"> kỹ thuật, giáo viên</w:t>
+      </w:r>
+      <w:r>
+        <w:t xml:space="preserve"> nhấn “Hoàn thành”.</w:t>
       </w:r>
     </w:p>
     <w:p>
@@ -845,6 +906,9 @@
       <w:r>
         <w:t>Nếu đạt yêu cầu → Trạng thái: Hoàn thành.</w:t>
       </w:r>
+      <w:r>
+        <w:t xml:space="preserve"> (Do cán bộ quản lý cập nhật)</w:t>
+      </w:r>
     </w:p>
     <w:p>
       <w:pPr>
@@ -855,6 +919,12 @@
       </w:pPr>
       <w:r>
         <w:t>Nếu chưa đạt → Yêu cầu thực hiện lại.</w:t>
+      </w:r>
+      <w:r>
+        <w:t xml:space="preserve"> </w:t>
+      </w:r>
+      <w:r>
+        <w:t>(Do cán bộ quản lý cập nhật)</w:t>
       </w:r>
     </w:p>
     <w:p>
@@ -890,7 +960,13 @@
         <w:jc w:val="both"/>
       </w:pPr>
       <w:r>
-        <w:t>Chức năng này cho phép các bộ phận như giáo viên, nhân viên, cán bộ quản lý gửi yêu cầu báo hỏng thiết bị để bộ phận kỹ thuật xử lý. Hệ thống tích hợp cơ chế thông báo qua email và cập nhật trạng thái theo vòng lặp phản hồi.</w:t>
+        <w:t>Chức năng này cho phép các bộ phậ</w:t>
+      </w:r>
+      <w:r>
+        <w:t>n như giáo viên</w:t>
+      </w:r>
+      <w:r>
+        <w:t>, cán bộ quản lý gửi yêu cầu báo hỏng thiết bị để bộ phận kỹ thuật xử lý. Hệ thống tích hợp cơ chế thông báo qua email và cập nhật trạng thái theo vòng lặp phản hồi.</w:t>
       </w:r>
     </w:p>
     <w:p>
@@ -921,7 +997,13 @@
         <w:jc w:val="both"/>
       </w:pPr>
       <w:r>
-        <w:t>Người dùng (giáo viên, nhân viên, cán bộ quản lý) đăng nhập hệ thống và thực hiện gửi báo hỏng.</w:t>
+        <w:t>Ngườ</w:t>
+      </w:r>
+      <w:r>
+        <w:t>i dùng (giáo viên</w:t>
+      </w:r>
+      <w:r>
+        <w:t>, cán bộ quản lý) đăng nhập hệ thống và thực hiện gửi báo hỏng.</w:t>
       </w:r>
     </w:p>
     <w:p>
@@ -1572,8 +1654,14 @@
           <w:ilvl w:val="0"/>
           <w:numId w:val="31"/>
         </w:numPr>
-      </w:pPr>
-      <w:r>
+        <w:rPr>
+          <w:highlight w:val="yellow"/>
+        </w:rPr>
+      </w:pPr>
+      <w:r>
+        <w:rPr>
+          <w:highlight w:val="yellow"/>
+        </w:rPr>
         <w:t>Tự động gửi email thông báo đến quản lý kỹ thuật</w:t>
       </w:r>
     </w:p>
@@ -1630,7 +1718,13 @@
         <w:jc w:val="both"/>
       </w:pPr>
       <w:r>
-        <w:t>Chức năng này cho phép quản lý việc xin nghỉ phép của nhân viên theo quy trình phê duyệt điện tử, đảm bảo tính xác thực, toàn vẹn và không thể chối bỏ thông qua cơ chế chữ ký số.</w:t>
+        <w:t xml:space="preserve">Chức năng này cho phép quản lý việc xin nghỉ phép của </w:t>
+      </w:r>
+      <w:r>
+        <w:t>giáo viên, nhân viên kỹ thuật</w:t>
+      </w:r>
+      <w:r>
+        <w:t xml:space="preserve"> theo quy trình phê duyệt điện tử, đảm bảo tính xác thực, toàn vẹn và không thể chối bỏ thông qua cơ chế chữ ký số.</w:t>
       </w:r>
     </w:p>
     <w:p>
@@ -1660,7 +1754,19 @@
         </w:numPr>
       </w:pPr>
       <w:r>
-        <w:t>Thông tin nhân viên gửi báo hỏng được đồng bộ (Tên người gửi, Email)</w:t>
+        <w:t>Thông tin nhân viên</w:t>
+      </w:r>
+      <w:r>
+        <w:t xml:space="preserve"> (giáo viên, nhân viên kỹ thuật)</w:t>
+      </w:r>
+      <w:r>
+        <w:t xml:space="preserve"> gửi báo </w:t>
+      </w:r>
+      <w:r>
+        <w:t>nghỉ</w:t>
+      </w:r>
+      <w:r>
+        <w:t xml:space="preserve"> được đồng bộ (Tên người gửi, Email)</w:t>
       </w:r>
     </w:p>
     <w:p>
@@ -1671,7 +1777,15 @@
         </w:numPr>
       </w:pPr>
       <w:r>
-        <w:t>Loại nghỉ (phép năm, nghỉ bệnh, nghỉ không lương,…)</w:t>
+        <w:t xml:space="preserve">Loại nghỉ (phép năm, nghỉ bệnh, nghỉ không </w:t>
+      </w:r>
+      <w:proofErr w:type="gramStart"/>
+      <w:r>
+        <w:t>lương,…</w:t>
+      </w:r>
+      <w:proofErr w:type="gramEnd"/>
+      <w:r>
+        <w:t>)</w:t>
       </w:r>
     </w:p>
     <w:p>
@@ -1753,7 +1867,21 @@
         <w:ind w:left="720"/>
       </w:pPr>
       <w:r>
-        <w:t>Nhân viên thực hiện ký số lên đơn nghỉ</w:t>
+        <w:t>N</w:t>
+      </w:r>
+      <w:r>
+        <w:t xml:space="preserve">hân viên (giáo viên, nhân viên kỹ </w:t>
+      </w:r>
+      <w:proofErr w:type="gramStart"/>
+      <w:r>
+        <w:t xml:space="preserve">thuật) </w:t>
+      </w:r>
+      <w:r>
+        <w:t xml:space="preserve"> thực</w:t>
+      </w:r>
+      <w:proofErr w:type="gramEnd"/>
+      <w:r>
+        <w:t xml:space="preserve"> hiện ký số lên đơn nghỉ</w:t>
       </w:r>
     </w:p>
     <w:p>
@@ -1872,7 +2000,16 @@
         </w:numPr>
       </w:pPr>
       <w:r>
-        <w:t>Kiểm tra chữ ký số của nhân viên (xác thực tính hợp lệ)</w:t>
+        <w:t xml:space="preserve">Kiểm tra chữ ký số của </w:t>
+      </w:r>
+      <w:r>
+        <w:t xml:space="preserve">nhân viên (giáo viên, nhân viên kỹ thuật) </w:t>
+      </w:r>
+      <w:r>
+        <w:t xml:space="preserve">để </w:t>
+      </w:r>
+      <w:r>
+        <w:t>xác thực tính hợp lệ</w:t>
       </w:r>
     </w:p>
     <w:p>
@@ -2034,6 +2171,8 @@
       <w:r>
         <w:t>Cập nhật lịch làm việc nội bộ</w:t>
       </w:r>
+      <w:bookmarkStart w:id="0" w:name="_GoBack"/>
+      <w:bookmarkEnd w:id="0"/>
     </w:p>
     <w:p>
       <w:pPr>
@@ -2076,16 +2215,14 @@
         </w:numPr>
       </w:pPr>
       <w:r>
-        <w:t>Gửi thông báo cho nhân viên</w:t>
-      </w:r>
-    </w:p>
-    <w:p>
-      <w:pPr>
-        <w:numPr>
-          <w:ilvl w:val="1"/>
-          <w:numId w:val="12"/>
-        </w:numPr>
-      </w:pPr>
+        <w:t xml:space="preserve">Gửi thông báo cho </w:t>
+      </w:r>
+      <w:r>
+        <w:t>nhân viên (giáo viên, nhân viên kỹ thuật)</w:t>
+      </w:r>
+      <w:r>
+        <w:t xml:space="preserve">. </w:t>
+      </w:r>
       <w:r>
         <w:t>Lưu hồ sơ kèm chữ ký số của người từ chối</w:t>
       </w:r>
@@ -2174,7 +2311,7 @@
 </file>
 
 <file path=word/numbering.xml><?xml version="1.0" encoding="utf-8"?>
-<w:numbering xmlns:wpc="http://schemas.microsoft.com/office/word/2010/wordprocessingCanvas" xmlns:cx="http://schemas.microsoft.com/office/drawing/2014/chartex" xmlns:cx1="http://schemas.microsoft.com/office/drawing/2015/9/8/chartex" xmlns:cx2="http://schemas.microsoft.com/office/drawing/2015/10/21/chartex" xmlns:cx3="http://schemas.microsoft.com/office/drawing/2016/5/9/chartex" xmlns:cx4="http://schemas.microsoft.com/office/drawing/2016/5/10/chartex" xmlns:cx5="http://schemas.microsoft.com/office/drawing/2016/5/11/chartex" xmlns:cx6="http://schemas.microsoft.com/office/drawing/2016/5/12/chartex" xmlns:cx7="http://schemas.microsoft.com/office/drawing/2016/5/13/chartex" xmlns:cx8="http://schemas.microsoft.com/office/drawing/2016/5/14/chartex" xmlns:mc="http://schemas.openxmlformats.org/markup-compatibility/2006" xmlns:aink="http://schemas.microsoft.com/office/drawing/2016/ink" xmlns:am3d="http://schemas.microsoft.com/office/drawing/2017/model3d" xmlns:o="urn:schemas-microsoft-com:office:office" xmlns:oel="http://schemas.microsoft.com/office/2019/extlst" xmlns:r="http://schemas.openxmlformats.org/officeDocument/2006/relationships" xmlns:m="http://schemas.openxmlformats.org/officeDocument/2006/math" xmlns:v="urn:schemas-microsoft-com:vml" xmlns:wp14="http://schemas.microsoft.com/office/word/2010/wordprocessingDrawing" xmlns:wp="http://schemas.openxmlformats.org/drawingml/2006/wordprocessingDrawing" xmlns:w10="urn:schemas-microsoft-com:office:word" xmlns:w="http://schemas.openxmlformats.org/wordprocessingml/2006/main" xmlns:w14="http://schemas.microsoft.com/office/word/2010/wordml" xmlns:w15="http://schemas.microsoft.com/office/word/2012/wordml" xmlns:w16cex="http://schemas.microsoft.com/office/word/2018/wordml/cex" xmlns:w16cid="http://schemas.microsoft.com/office/word/2016/wordml/cid" xmlns:w16="http://schemas.microsoft.com/office/word/2018/wordml" xmlns:w16du="http://schemas.microsoft.com/office/word/2023/wordml/word16du" xmlns:w16sdtdh="http://schemas.microsoft.com/office/word/2020/wordml/sdtdatahash" xmlns:w16se="http://schemas.microsoft.com/office/word/2015/wordml/symex" xmlns:wpg="http://schemas.microsoft.com/office/word/2010/wordprocessingGroup" xmlns:wpi="http://schemas.microsoft.com/office/word/2010/wordprocessingInk" xmlns:wne="http://schemas.microsoft.com/office/word/2006/wordml" xmlns:wps="http://schemas.microsoft.com/office/word/2010/wordprocessingShape" mc:Ignorable="w14 w15 w16se w16cid w16 w16cex w16sdtdh w16du wp14">
+<w:numbering xmlns:wpc="http://schemas.microsoft.com/office/word/2010/wordprocessingCanvas" xmlns:cx="http://schemas.microsoft.com/office/drawing/2014/chartex" xmlns:mc="http://schemas.openxmlformats.org/markup-compatibility/2006" xmlns:o="urn:schemas-microsoft-com:office:office" xmlns:r="http://schemas.openxmlformats.org/officeDocument/2006/relationships" xmlns:m="http://schemas.openxmlformats.org/officeDocument/2006/math" xmlns:v="urn:schemas-microsoft-com:vml" xmlns:wp14="http://schemas.microsoft.com/office/word/2010/wordprocessingDrawing" xmlns:wp="http://schemas.openxmlformats.org/drawingml/2006/wordprocessingDrawing" xmlns:w10="urn:schemas-microsoft-com:office:word" xmlns:w="http://schemas.openxmlformats.org/wordprocessingml/2006/main" xmlns:w14="http://schemas.microsoft.com/office/word/2010/wordml" xmlns:w15="http://schemas.microsoft.com/office/word/2012/wordml" xmlns:w16se="http://schemas.microsoft.com/office/word/2015/wordml/symex" xmlns:wpg="http://schemas.microsoft.com/office/word/2010/wordprocessingGroup" xmlns:wpi="http://schemas.microsoft.com/office/word/2010/wordprocessingInk" xmlns:wne="http://schemas.microsoft.com/office/word/2006/wordml" xmlns:wps="http://schemas.microsoft.com/office/word/2010/wordprocessingShape" mc:Ignorable="w14 w15 w16se wp14">
   <w:abstractNum w:abstractNumId="0" w15:restartNumberingAfterBreak="0">
     <w:nsid w:val="03022223"/>
     <w:multiLevelType w:val="multilevel"/>
@@ -6762,104 +6899,104 @@
       </w:pPr>
     </w:lvl>
   </w:abstractNum>
-  <w:num w:numId="1" w16cid:durableId="860357312">
+  <w:num w:numId="1">
     <w:abstractNumId w:val="30"/>
   </w:num>
-  <w:num w:numId="2" w16cid:durableId="638194816">
+  <w:num w:numId="2">
     <w:abstractNumId w:val="3"/>
   </w:num>
-  <w:num w:numId="3" w16cid:durableId="1852916502">
+  <w:num w:numId="3">
     <w:abstractNumId w:val="29"/>
   </w:num>
-  <w:num w:numId="4" w16cid:durableId="1367635630">
+  <w:num w:numId="4">
     <w:abstractNumId w:val="23"/>
   </w:num>
-  <w:num w:numId="5" w16cid:durableId="1473936749">
+  <w:num w:numId="5">
     <w:abstractNumId w:val="19"/>
   </w:num>
-  <w:num w:numId="6" w16cid:durableId="31810040">
+  <w:num w:numId="6">
     <w:abstractNumId w:val="0"/>
   </w:num>
-  <w:num w:numId="7" w16cid:durableId="72239181">
+  <w:num w:numId="7">
     <w:abstractNumId w:val="13"/>
   </w:num>
-  <w:num w:numId="8" w16cid:durableId="985478258">
+  <w:num w:numId="8">
     <w:abstractNumId w:val="18"/>
   </w:num>
-  <w:num w:numId="9" w16cid:durableId="716660746">
+  <w:num w:numId="9">
     <w:abstractNumId w:val="27"/>
   </w:num>
-  <w:num w:numId="10" w16cid:durableId="1478374235">
+  <w:num w:numId="10">
     <w:abstractNumId w:val="26"/>
   </w:num>
-  <w:num w:numId="11" w16cid:durableId="1026784885">
+  <w:num w:numId="11">
     <w:abstractNumId w:val="5"/>
   </w:num>
-  <w:num w:numId="12" w16cid:durableId="902520758">
+  <w:num w:numId="12">
     <w:abstractNumId w:val="11"/>
   </w:num>
-  <w:num w:numId="13" w16cid:durableId="1568610189">
+  <w:num w:numId="13">
     <w:abstractNumId w:val="22"/>
   </w:num>
-  <w:num w:numId="14" w16cid:durableId="1030187234">
+  <w:num w:numId="14">
     <w:abstractNumId w:val="10"/>
   </w:num>
-  <w:num w:numId="15" w16cid:durableId="120614593">
+  <w:num w:numId="15">
     <w:abstractNumId w:val="6"/>
   </w:num>
-  <w:num w:numId="16" w16cid:durableId="1122382366">
+  <w:num w:numId="16">
     <w:abstractNumId w:val="20"/>
   </w:num>
-  <w:num w:numId="17" w16cid:durableId="1911499010">
+  <w:num w:numId="17">
     <w:abstractNumId w:val="28"/>
   </w:num>
-  <w:num w:numId="18" w16cid:durableId="1249844617">
+  <w:num w:numId="18">
     <w:abstractNumId w:val="24"/>
   </w:num>
-  <w:num w:numId="19" w16cid:durableId="40130516">
+  <w:num w:numId="19">
     <w:abstractNumId w:val="14"/>
   </w:num>
-  <w:num w:numId="20" w16cid:durableId="115872912">
+  <w:num w:numId="20">
     <w:abstractNumId w:val="12"/>
   </w:num>
-  <w:num w:numId="21" w16cid:durableId="371074474">
+  <w:num w:numId="21">
     <w:abstractNumId w:val="9"/>
   </w:num>
-  <w:num w:numId="22" w16cid:durableId="212890279">
+  <w:num w:numId="22">
     <w:abstractNumId w:val="15"/>
   </w:num>
-  <w:num w:numId="23" w16cid:durableId="817919625">
+  <w:num w:numId="23">
     <w:abstractNumId w:val="21"/>
   </w:num>
-  <w:num w:numId="24" w16cid:durableId="1253978532">
+  <w:num w:numId="24">
     <w:abstractNumId w:val="17"/>
   </w:num>
-  <w:num w:numId="25" w16cid:durableId="1202982899">
+  <w:num w:numId="25">
     <w:abstractNumId w:val="4"/>
   </w:num>
-  <w:num w:numId="26" w16cid:durableId="506407258">
+  <w:num w:numId="26">
     <w:abstractNumId w:val="2"/>
   </w:num>
-  <w:num w:numId="27" w16cid:durableId="846675645">
+  <w:num w:numId="27">
     <w:abstractNumId w:val="25"/>
   </w:num>
-  <w:num w:numId="28" w16cid:durableId="1708413314">
+  <w:num w:numId="28">
     <w:abstractNumId w:val="7"/>
   </w:num>
-  <w:num w:numId="29" w16cid:durableId="1566334321">
+  <w:num w:numId="29">
     <w:abstractNumId w:val="8"/>
   </w:num>
-  <w:num w:numId="30" w16cid:durableId="102041086">
+  <w:num w:numId="30">
     <w:abstractNumId w:val="16"/>
   </w:num>
-  <w:num w:numId="31" w16cid:durableId="1265920488">
+  <w:num w:numId="31">
     <w:abstractNumId w:val="1"/>
   </w:num>
 </w:numbering>
 </file>
 
 <file path=word/styles.xml><?xml version="1.0" encoding="utf-8"?>
-<w:styles xmlns:mc="http://schemas.openxmlformats.org/markup-compatibility/2006" xmlns:r="http://schemas.openxmlformats.org/officeDocument/2006/relationships" xmlns:w="http://schemas.openxmlformats.org/wordprocessingml/2006/main" xmlns:w14="http://schemas.microsoft.com/office/word/2010/wordml" xmlns:w15="http://schemas.microsoft.com/office/word/2012/wordml" xmlns:w16cex="http://schemas.microsoft.com/office/word/2018/wordml/cex" xmlns:w16cid="http://schemas.microsoft.com/office/word/2016/wordml/cid" xmlns:w16="http://schemas.microsoft.com/office/word/2018/wordml" xmlns:w16du="http://schemas.microsoft.com/office/word/2023/wordml/word16du" xmlns:w16sdtdh="http://schemas.microsoft.com/office/word/2020/wordml/sdtdatahash" xmlns:w16se="http://schemas.microsoft.com/office/word/2015/wordml/symex" mc:Ignorable="w14 w15 w16se w16cid w16 w16cex w16sdtdh w16du">
+<w:styles xmlns:mc="http://schemas.openxmlformats.org/markup-compatibility/2006" xmlns:r="http://schemas.openxmlformats.org/officeDocument/2006/relationships" xmlns:w="http://schemas.openxmlformats.org/wordprocessingml/2006/main" xmlns:w14="http://schemas.microsoft.com/office/word/2010/wordml" xmlns:w15="http://schemas.microsoft.com/office/word/2012/wordml" xmlns:w16se="http://schemas.microsoft.com/office/word/2015/wordml/symex" mc:Ignorable="w14 w15 w16se">
   <w:docDefaults>
     <w:rPrDefault>
       <w:rPr>
@@ -6877,7 +7014,7 @@
       </w:pPr>
     </w:pPrDefault>
   </w:docDefaults>
-  <w:latentStyles w:defLockedState="0" w:defUIPriority="99" w:defSemiHidden="0" w:defUnhideWhenUsed="0" w:defQFormat="0" w:count="376">
+  <w:latentStyles w:defLockedState="0" w:defUIPriority="99" w:defSemiHidden="0" w:defUnhideWhenUsed="0" w:defQFormat="0" w:count="371">
     <w:lsdException w:name="Normal" w:uiPriority="0" w:qFormat="1"/>
     <w:lsdException w:name="heading 1" w:uiPriority="9" w:qFormat="1"/>
     <w:lsdException w:name="heading 2" w:semiHidden="1" w:uiPriority="9" w:unhideWhenUsed="1" w:qFormat="1"/>
@@ -7249,11 +7386,6 @@
     <w:lsdException w:name="List Table 5 Dark Accent 6" w:uiPriority="50"/>
     <w:lsdException w:name="List Table 6 Colorful Accent 6" w:uiPriority="51"/>
     <w:lsdException w:name="List Table 7 Colorful Accent 6" w:uiPriority="52"/>
-    <w:lsdException w:name="Mention" w:semiHidden="1" w:unhideWhenUsed="1"/>
-    <w:lsdException w:name="Smart Hyperlink" w:semiHidden="1" w:unhideWhenUsed="1"/>
-    <w:lsdException w:name="Hashtag" w:semiHidden="1" w:unhideWhenUsed="1"/>
-    <w:lsdException w:name="Unresolved Mention" w:semiHidden="1" w:unhideWhenUsed="1"/>
-    <w:lsdException w:name="Smart Link" w:semiHidden="1" w:unhideWhenUsed="1"/>
   </w:latentStyles>
   <w:style w:type="paragraph" w:default="1" w:styleId="Normal">
     <w:name w:val="Normal"/>
@@ -7262,6 +7394,7 @@
   <w:style w:type="character" w:default="1" w:styleId="DefaultParagraphFont">
     <w:name w:val="Default Paragraph Font"/>
     <w:uiPriority w:val="1"/>
+    <w:semiHidden/>
     <w:unhideWhenUsed/>
   </w:style>
   <w:style w:type="table" w:default="1" w:styleId="TableNormal">
@@ -8069,7 +8202,7 @@
 </file>
 
 <file path=customXml/itemProps1.xml><?xml version="1.0" encoding="utf-8"?>
-<ds:datastoreItem xmlns:ds="http://schemas.openxmlformats.org/officeDocument/2006/customXml" ds:itemID="{98490DD4-954D-4656-B192-5673749EC67D}">
+<ds:datastoreItem xmlns:ds="http://schemas.openxmlformats.org/officeDocument/2006/customXml" ds:itemID="{11EAE973-2C70-4266-9320-9EBFDF1C1F6F}">
   <ds:schemaRefs>
     <ds:schemaRef ds:uri="http://schemas.openxmlformats.org/officeDocument/2006/bibliography"/>
   </ds:schemaRefs>

</xml_diff>